<commit_message>
Them tron bo 3 file Word de kiem tra on tap KHTN 9 Sinh hoc (Mendel, DNA, RNA) tu 2 anh chup: Hoc sinh, Giao vien, Day tren man hinh va cap nhat tron bo
</commit_message>
<xml_diff>
--- a/San_Pham/De_Cuong_KHTN_9_Giua_HK1_Kim_Long_TronBo_DayTrenManHinh.docx
+++ b/San_Pham/De_Cuong_KHTN_9_Giua_HK1_Kim_Long_TronBo_DayTrenManHinh.docx
@@ -13563,7 +13563,7 @@
           <w:color w:val="2E7D32"/>
           <w:sz w:val="23"/>
         </w:rPr>
-        <w:t>II. Trắc nghiệm Sinh học - Phần 2: Trắc nghiệm đúng sai (2 câu)</w:t>
+        <w:t>II. Trắc nghiệm Sinh học - Phần 2: Trắc nghiệm đúng sai (5 câu)</w:t>
       </w:r>
     </w:p>
     <w:p>
@@ -13588,7 +13588,7 @@
           <w:i w:val="0"/>
           <w:sz w:val="23"/>
         </w:rPr>
-        <w:t xml:space="preserve"> Khi tìm hiểu các thuật ngữ cơ bản trong di truyền học, hãy xác định mỗi nhận định sau là đúng hay sai.</w:t>
+        <w:t xml:space="preserve"> Khi tìm hiểu các thuật ngữ cơ bản trong di truyền học Mendel. Hãy xác định các nhận định sau là đúng hay sai.</w:t>
       </w:r>
     </w:p>
     <w:p>
@@ -13612,7 +13612,7 @@
           <w:i w:val="0"/>
           <w:sz w:val="23"/>
         </w:rPr>
-        <w:t>Tính trạng là những đặc điểm về hình thái, cấu tạo và sinh lí của cơ thể.</w:t>
+        <w:t>Tính trạng là những đặc điểm về hình thái, cấu tạo và sinh lí của một cơ thể.</w:t>
       </w:r>
     </w:p>
     <w:p>
@@ -13636,7 +13636,7 @@
           <w:i w:val="0"/>
           <w:sz w:val="23"/>
         </w:rPr>
-        <w:t>Tính trạng tương phản là hai trạng thái biểu hiện giống nhau của cùng một loại tính trạng.</w:t>
+        <w:t>Cặp tính trạng tương phản là hai trạng thái biểu hiện giống nhau của cùng một loại tính trạng.</w:t>
       </w:r>
     </w:p>
     <w:p>
@@ -13831,7 +13831,7 @@
           <w:i w:val="0"/>
           <w:sz w:val="23"/>
         </w:rPr>
-        <w:t>Khi cho F</w:t>
+        <w:t>Cho các cây F</w:t>
       </w:r>
       <w:r>
         <w:rPr>
@@ -13850,7 +13850,7 @@
           <w:i w:val="0"/>
           <w:sz w:val="23"/>
         </w:rPr>
-        <w:t xml:space="preserve"> tự thụ phấn, đời F</w:t>
+        <w:t xml:space="preserve"> tự thụ phấn, F</w:t>
       </w:r>
       <w:r>
         <w:rPr>
@@ -13869,7 +13869,7 @@
           <w:i w:val="0"/>
           <w:sz w:val="23"/>
         </w:rPr>
-        <w:t xml:space="preserve"> thu được tỉ lệ kiểu hình xấp xỉ 3 hoa tím : 1 hoa trắng.</w:t>
+        <w:t xml:space="preserve"> có tỉ lệ kiểu hình 3 hoa tím : 1 hoa trắng.</w:t>
       </w:r>
     </w:p>
     <w:p>
@@ -13893,7 +13893,7 @@
           <w:i w:val="0"/>
           <w:sz w:val="23"/>
         </w:rPr>
-        <w:t>Cây hoa trắng xuất hiện ở F</w:t>
+        <w:t>Ở F</w:t>
       </w:r>
       <w:r>
         <w:rPr>
@@ -13912,7 +13912,7 @@
           <w:i w:val="0"/>
           <w:sz w:val="23"/>
         </w:rPr>
-        <w:t xml:space="preserve"> có kiểu gene dị hợp tử.</w:t>
+        <w:t>, tất cả các cây hoa tím đều có kiểu gene đồng hợp.</w:t>
       </w:r>
     </w:p>
     <w:p>
@@ -13934,6 +13934,1840 @@
           <w:sz w:val="19"/>
         </w:rPr>
         <w:t>✎ Ghi chú &amp; Lời giải trực tiếp trên màn hình:</w:t>
+        <w:br/>
+      </w:r>
+      <w:r>
+        <w:br/>
+      </w:r>
+      <w:r>
+        <w:br/>
+      </w:r>
+      <w:r>
+        <w:br/>
+      </w:r>
+    </w:p>
+    <w:p>
+      <w:pPr>
+        <w:keepNext/>
+        <w:spacing w:before="80" w:after="40" w:line="276" w:lineRule="auto"/>
+      </w:pPr>
+      <w:r>
+        <w:rPr>
+          <w:rFonts w:ascii="Times New Roman" w:hAnsi="Times New Roman"/>
+          <w:b/>
+          <w:i w:val="0"/>
+          <w:color w:val="C62828"/>
+          <w:sz w:val="23"/>
+        </w:rPr>
+        <w:t>Câu 3.</w:t>
+      </w:r>
+      <w:r>
+        <w:rPr>
+          <w:rFonts w:ascii="Times New Roman" w:hAnsi="Times New Roman"/>
+          <w:b w:val="0"/>
+          <w:i w:val="0"/>
+          <w:sz w:val="23"/>
+        </w:rPr>
+        <w:t xml:space="preserve"> Về phép lai phân tích, hãy xác định các nhận định sau là đúng hay sai.</w:t>
+      </w:r>
+    </w:p>
+    <w:p>
+      <w:pPr>
+        <w:spacing w:before="20" w:after="20" w:line="276" w:lineRule="auto"/>
+        <w:ind w:left="283"/>
+      </w:pPr>
+      <w:r>
+        <w:rPr>
+          <w:rFonts w:ascii="Times New Roman" w:hAnsi="Times New Roman"/>
+          <w:b/>
+          <w:i w:val="0"/>
+          <w:sz w:val="23"/>
+        </w:rPr>
+        <w:t xml:space="preserve">a) </w:t>
+      </w:r>
+      <w:r>
+        <w:rPr>
+          <w:rFonts w:ascii="Times New Roman" w:hAnsi="Times New Roman"/>
+          <w:b w:val="0"/>
+          <w:i w:val="0"/>
+          <w:sz w:val="23"/>
+        </w:rPr>
+        <w:t>Lai phân tích là phép lai giữa cơ thể mang tính trạng trội chưa biết kiểu gene với cơ thể mang tính trạng lặn.</w:t>
+      </w:r>
+    </w:p>
+    <w:p>
+      <w:pPr>
+        <w:spacing w:before="20" w:after="20" w:line="276" w:lineRule="auto"/>
+        <w:ind w:left="283"/>
+      </w:pPr>
+      <w:r>
+        <w:rPr>
+          <w:rFonts w:ascii="Times New Roman" w:hAnsi="Times New Roman"/>
+          <w:b/>
+          <w:i w:val="0"/>
+          <w:sz w:val="23"/>
+        </w:rPr>
+        <w:t xml:space="preserve">b) </w:t>
+      </w:r>
+      <w:r>
+        <w:rPr>
+          <w:rFonts w:ascii="Times New Roman" w:hAnsi="Times New Roman"/>
+          <w:b w:val="0"/>
+          <w:i w:val="0"/>
+          <w:sz w:val="23"/>
+        </w:rPr>
+        <w:t>Lai phân tích giúp xác định kiểu gene của cơ thể mang tính trạng trội.</w:t>
+      </w:r>
+    </w:p>
+    <w:p>
+      <w:pPr>
+        <w:spacing w:before="20" w:after="20" w:line="276" w:lineRule="auto"/>
+        <w:ind w:left="283"/>
+      </w:pPr>
+      <w:r>
+        <w:rPr>
+          <w:rFonts w:ascii="Times New Roman" w:hAnsi="Times New Roman"/>
+          <w:b/>
+          <w:i w:val="0"/>
+          <w:sz w:val="23"/>
+        </w:rPr>
+        <w:t xml:space="preserve">c) </w:t>
+      </w:r>
+      <w:r>
+        <w:rPr>
+          <w:rFonts w:ascii="Times New Roman" w:hAnsi="Times New Roman"/>
+          <w:b w:val="0"/>
+          <w:i w:val="0"/>
+          <w:sz w:val="23"/>
+        </w:rPr>
+        <w:t>Nếu phép lai phân tích cho đời con có 100% kiểu hình trội thì cơ thể cần kiểm tra chắc chắn có kiểu gene đồng hợp trội, trong điều kiện di truyền Mendel đơn gene và trội hoàn toàn.</w:t>
+      </w:r>
+    </w:p>
+    <w:p>
+      <w:pPr>
+        <w:spacing w:before="20" w:after="20" w:line="276" w:lineRule="auto"/>
+        <w:ind w:left="283"/>
+      </w:pPr>
+      <w:r>
+        <w:rPr>
+          <w:rFonts w:ascii="Times New Roman" w:hAnsi="Times New Roman"/>
+          <w:b/>
+          <w:i w:val="0"/>
+          <w:sz w:val="23"/>
+        </w:rPr>
+        <w:t xml:space="preserve">d) </w:t>
+      </w:r>
+      <w:r>
+        <w:rPr>
+          <w:rFonts w:ascii="Times New Roman" w:hAnsi="Times New Roman"/>
+          <w:b w:val="0"/>
+          <w:i w:val="0"/>
+          <w:sz w:val="23"/>
+        </w:rPr>
+        <w:t>Nếu cơ thể cần kiểm tra có kiểu gene dị hợp thì phép lai phân tích cho đời con có tỉ lệ kiểu hình 3 trội : 1 lặn.</w:t>
+      </w:r>
+    </w:p>
+    <w:p>
+      <w:pPr>
+        <w:spacing w:before="60" w:after="100"/>
+        <w:ind w:left="283"/>
+        <w:pBdr>
+          <w:top w:val="dashed" w:sz="4" w:space="4" w:color="B0BEC5"/>
+          <w:bottom w:val="dashed" w:sz="4" w:space="4" w:color="B0BEC5"/>
+          <w:left w:val="single" w:sz="12" w:space="6" w:color="7E57C2"/>
+        </w:pBdr>
+      </w:pPr>
+      <w:r>
+        <w:rPr>
+          <w:rFonts w:ascii="Times New Roman" w:hAnsi="Times New Roman"/>
+          <w:b/>
+          <w:i w:val="0"/>
+          <w:color w:val="6A1B9A"/>
+          <w:sz w:val="19"/>
+        </w:rPr>
+        <w:t>✎ Ghi chú &amp; Lời giải trực tiếp trên màn hình:</w:t>
+        <w:br/>
+      </w:r>
+      <w:r>
+        <w:br/>
+      </w:r>
+      <w:r>
+        <w:br/>
+      </w:r>
+      <w:r>
+        <w:br/>
+      </w:r>
+    </w:p>
+    <w:p>
+      <w:pPr>
+        <w:keepNext/>
+        <w:spacing w:before="80" w:after="40" w:line="276" w:lineRule="auto"/>
+      </w:pPr>
+      <w:r>
+        <w:rPr>
+          <w:rFonts w:ascii="Times New Roman" w:hAnsi="Times New Roman"/>
+          <w:b/>
+          <w:i w:val="0"/>
+          <w:color w:val="C62828"/>
+          <w:sz w:val="23"/>
+        </w:rPr>
+        <w:t>Câu 4.</w:t>
+      </w:r>
+      <w:r>
+        <w:rPr>
+          <w:rFonts w:ascii="Times New Roman" w:hAnsi="Times New Roman"/>
+          <w:b w:val="0"/>
+          <w:i w:val="0"/>
+          <w:sz w:val="23"/>
+        </w:rPr>
+        <w:t xml:space="preserve"> Về cấu tạo hóa học của DNA, hãy xác định các nhận định sau là đúng hay sai.</w:t>
+      </w:r>
+    </w:p>
+    <w:p>
+      <w:pPr>
+        <w:spacing w:before="20" w:after="20" w:line="276" w:lineRule="auto"/>
+        <w:ind w:left="283"/>
+      </w:pPr>
+      <w:r>
+        <w:rPr>
+          <w:rFonts w:ascii="Times New Roman" w:hAnsi="Times New Roman"/>
+          <w:b/>
+          <w:i w:val="0"/>
+          <w:sz w:val="23"/>
+        </w:rPr>
+        <w:t xml:space="preserve">a) </w:t>
+      </w:r>
+      <w:r>
+        <w:rPr>
+          <w:rFonts w:ascii="Times New Roman" w:hAnsi="Times New Roman"/>
+          <w:b w:val="0"/>
+          <w:i w:val="0"/>
+          <w:sz w:val="23"/>
+        </w:rPr>
+        <w:t>DNA là đại phân tử có cấu tạo theo nguyên tắc đa phân.</w:t>
+      </w:r>
+    </w:p>
+    <w:p>
+      <w:pPr>
+        <w:spacing w:before="20" w:after="20" w:line="276" w:lineRule="auto"/>
+        <w:ind w:left="283"/>
+      </w:pPr>
+      <w:r>
+        <w:rPr>
+          <w:rFonts w:ascii="Times New Roman" w:hAnsi="Times New Roman"/>
+          <w:b/>
+          <w:i w:val="0"/>
+          <w:sz w:val="23"/>
+        </w:rPr>
+        <w:t xml:space="preserve">b) </w:t>
+      </w:r>
+      <w:r>
+        <w:rPr>
+          <w:rFonts w:ascii="Times New Roman" w:hAnsi="Times New Roman"/>
+          <w:b w:val="0"/>
+          <w:i w:val="0"/>
+          <w:sz w:val="23"/>
+        </w:rPr>
+        <w:t>Đơn phân cấu tạo nên DNA là nucleotide.</w:t>
+      </w:r>
+    </w:p>
+    <w:p>
+      <w:pPr>
+        <w:spacing w:before="20" w:after="20" w:line="276" w:lineRule="auto"/>
+        <w:ind w:left="283"/>
+      </w:pPr>
+      <w:r>
+        <w:rPr>
+          <w:rFonts w:ascii="Times New Roman" w:hAnsi="Times New Roman"/>
+          <w:b/>
+          <w:i w:val="0"/>
+          <w:sz w:val="23"/>
+        </w:rPr>
+        <w:t xml:space="preserve">c) </w:t>
+      </w:r>
+      <w:r>
+        <w:rPr>
+          <w:rFonts w:ascii="Times New Roman" w:hAnsi="Times New Roman"/>
+          <w:b w:val="0"/>
+          <w:i w:val="0"/>
+          <w:sz w:val="23"/>
+        </w:rPr>
+        <w:t>DNA được cấu tạo từ bốn loại nucleotide là A, T, G và C.</w:t>
+      </w:r>
+    </w:p>
+    <w:p>
+      <w:pPr>
+        <w:spacing w:before="20" w:after="20" w:line="276" w:lineRule="auto"/>
+        <w:ind w:left="283"/>
+      </w:pPr>
+      <w:r>
+        <w:rPr>
+          <w:rFonts w:ascii="Times New Roman" w:hAnsi="Times New Roman"/>
+          <w:b/>
+          <w:i w:val="0"/>
+          <w:sz w:val="23"/>
+        </w:rPr>
+        <w:t xml:space="preserve">d) </w:t>
+      </w:r>
+      <w:r>
+        <w:rPr>
+          <w:rFonts w:ascii="Times New Roman" w:hAnsi="Times New Roman"/>
+          <w:b w:val="0"/>
+          <w:i w:val="0"/>
+          <w:sz w:val="23"/>
+        </w:rPr>
+        <w:t>Trong DNA, nucleotide A liên kết bổ sung với nucleotide G, còn T liên kết với C.</w:t>
+      </w:r>
+    </w:p>
+    <w:p>
+      <w:pPr>
+        <w:spacing w:before="60" w:after="100"/>
+        <w:ind w:left="283"/>
+        <w:pBdr>
+          <w:top w:val="dashed" w:sz="4" w:space="4" w:color="B0BEC5"/>
+          <w:bottom w:val="dashed" w:sz="4" w:space="4" w:color="B0BEC5"/>
+          <w:left w:val="single" w:sz="12" w:space="6" w:color="7E57C2"/>
+        </w:pBdr>
+      </w:pPr>
+      <w:r>
+        <w:rPr>
+          <w:rFonts w:ascii="Times New Roman" w:hAnsi="Times New Roman"/>
+          <w:b/>
+          <w:i w:val="0"/>
+          <w:color w:val="6A1B9A"/>
+          <w:sz w:val="19"/>
+        </w:rPr>
+        <w:t>✎ Ghi chú &amp; Lời giải trực tiếp trên màn hình:</w:t>
+        <w:br/>
+      </w:r>
+      <w:r>
+        <w:br/>
+      </w:r>
+      <w:r>
+        <w:br/>
+      </w:r>
+      <w:r>
+        <w:br/>
+      </w:r>
+    </w:p>
+    <w:p>
+      <w:pPr>
+        <w:keepNext/>
+        <w:spacing w:before="80" w:after="40" w:line="276" w:lineRule="auto"/>
+      </w:pPr>
+      <w:r>
+        <w:rPr>
+          <w:rFonts w:ascii="Times New Roman" w:hAnsi="Times New Roman"/>
+          <w:b/>
+          <w:i w:val="0"/>
+          <w:color w:val="C62828"/>
+          <w:sz w:val="23"/>
+        </w:rPr>
+        <w:t>Câu 5.</w:t>
+      </w:r>
+      <w:r>
+        <w:rPr>
+          <w:rFonts w:ascii="Times New Roman" w:hAnsi="Times New Roman"/>
+          <w:b w:val="0"/>
+          <w:i w:val="0"/>
+          <w:sz w:val="23"/>
+        </w:rPr>
+        <w:t xml:space="preserve"> Về cấu tạo của RNA, hãy xác định các nhận định sau là đúng hay sai.</w:t>
+      </w:r>
+    </w:p>
+    <w:p>
+      <w:pPr>
+        <w:spacing w:before="20" w:after="20" w:line="276" w:lineRule="auto"/>
+        <w:ind w:left="283"/>
+      </w:pPr>
+      <w:r>
+        <w:rPr>
+          <w:rFonts w:ascii="Times New Roman" w:hAnsi="Times New Roman"/>
+          <w:b/>
+          <w:i w:val="0"/>
+          <w:sz w:val="23"/>
+        </w:rPr>
+        <w:t xml:space="preserve">a) </w:t>
+      </w:r>
+      <w:r>
+        <w:rPr>
+          <w:rFonts w:ascii="Times New Roman" w:hAnsi="Times New Roman"/>
+          <w:b w:val="0"/>
+          <w:i w:val="0"/>
+          <w:sz w:val="23"/>
+        </w:rPr>
+        <w:t>RNA được cấu tạo theo nguyên tắc đa phân, đơn phân là nucleotide.</w:t>
+      </w:r>
+    </w:p>
+    <w:p>
+      <w:pPr>
+        <w:spacing w:before="20" w:after="20" w:line="276" w:lineRule="auto"/>
+        <w:ind w:left="283"/>
+      </w:pPr>
+      <w:r>
+        <w:rPr>
+          <w:rFonts w:ascii="Times New Roman" w:hAnsi="Times New Roman"/>
+          <w:b/>
+          <w:i w:val="0"/>
+          <w:sz w:val="23"/>
+        </w:rPr>
+        <w:t xml:space="preserve">b) </w:t>
+      </w:r>
+      <w:r>
+        <w:rPr>
+          <w:rFonts w:ascii="Times New Roman" w:hAnsi="Times New Roman"/>
+          <w:b w:val="0"/>
+          <w:i w:val="0"/>
+          <w:sz w:val="23"/>
+        </w:rPr>
+        <w:t>RNA có bốn loại nucleotide là A, T, G và C.</w:t>
+      </w:r>
+    </w:p>
+    <w:p>
+      <w:pPr>
+        <w:spacing w:before="20" w:after="20" w:line="276" w:lineRule="auto"/>
+        <w:ind w:left="283"/>
+      </w:pPr>
+      <w:r>
+        <w:rPr>
+          <w:rFonts w:ascii="Times New Roman" w:hAnsi="Times New Roman"/>
+          <w:b/>
+          <w:i w:val="0"/>
+          <w:sz w:val="23"/>
+        </w:rPr>
+        <w:t xml:space="preserve">c) </w:t>
+      </w:r>
+      <w:r>
+        <w:rPr>
+          <w:rFonts w:ascii="Times New Roman" w:hAnsi="Times New Roman"/>
+          <w:b w:val="0"/>
+          <w:i w:val="0"/>
+          <w:sz w:val="23"/>
+        </w:rPr>
+        <w:t>RNA có nucleotide U thay cho nucleotide T của DNA.</w:t>
+      </w:r>
+    </w:p>
+    <w:p>
+      <w:pPr>
+        <w:spacing w:before="20" w:after="20" w:line="276" w:lineRule="auto"/>
+        <w:ind w:left="283"/>
+      </w:pPr>
+      <w:r>
+        <w:rPr>
+          <w:rFonts w:ascii="Times New Roman" w:hAnsi="Times New Roman"/>
+          <w:b/>
+          <w:i w:val="0"/>
+          <w:sz w:val="23"/>
+        </w:rPr>
+        <w:t xml:space="preserve">d) </w:t>
+      </w:r>
+      <w:r>
+        <w:rPr>
+          <w:rFonts w:ascii="Times New Roman" w:hAnsi="Times New Roman"/>
+          <w:b w:val="0"/>
+          <w:i w:val="0"/>
+          <w:sz w:val="23"/>
+        </w:rPr>
+        <w:t>Các nucleotide trên mạch RNA liên kết với nhau bằng liên kết cộng hóa trị.</w:t>
+      </w:r>
+    </w:p>
+    <w:p>
+      <w:pPr>
+        <w:spacing w:before="60" w:after="100"/>
+        <w:ind w:left="283"/>
+        <w:pBdr>
+          <w:top w:val="dashed" w:sz="4" w:space="4" w:color="B0BEC5"/>
+          <w:bottom w:val="dashed" w:sz="4" w:space="4" w:color="B0BEC5"/>
+          <w:left w:val="single" w:sz="12" w:space="6" w:color="7E57C2"/>
+        </w:pBdr>
+      </w:pPr>
+      <w:r>
+        <w:rPr>
+          <w:rFonts w:ascii="Times New Roman" w:hAnsi="Times New Roman"/>
+          <w:b/>
+          <w:i w:val="0"/>
+          <w:color w:val="6A1B9A"/>
+          <w:sz w:val="19"/>
+        </w:rPr>
+        <w:t>✎ Ghi chú &amp; Lời giải trực tiếp trên màn hình:</w:t>
+        <w:br/>
+      </w:r>
+      <w:r>
+        <w:br/>
+      </w:r>
+      <w:r>
+        <w:br/>
+      </w:r>
+      <w:r>
+        <w:br/>
+      </w:r>
+    </w:p>
+    <w:p>
+      <w:pPr>
+        <w:keepNext/>
+        <w:spacing w:before="140" w:after="40"/>
+      </w:pPr>
+      <w:r>
+        <w:rPr>
+          <w:rFonts w:ascii="Times New Roman" w:hAnsi="Times New Roman"/>
+          <w:b/>
+          <w:i w:val="0"/>
+          <w:color w:val="2E7D32"/>
+          <w:sz w:val="23"/>
+        </w:rPr>
+        <w:t>II. Trắc nghiệm Sinh học - Phần 3: Câu hỏi trả lời ngắn (15 câu)</w:t>
+      </w:r>
+    </w:p>
+    <w:p>
+      <w:pPr>
+        <w:keepNext/>
+        <w:spacing w:before="60" w:after="40" w:line="276" w:lineRule="auto"/>
+      </w:pPr>
+      <w:r>
+        <w:rPr>
+          <w:rFonts w:ascii="Times New Roman" w:hAnsi="Times New Roman"/>
+          <w:b/>
+          <w:i w:val="0"/>
+          <w:color w:val="C62828"/>
+          <w:sz w:val="23"/>
+        </w:rPr>
+        <w:t>Câu 1.</w:t>
+      </w:r>
+      <w:r>
+        <w:rPr>
+          <w:rFonts w:ascii="Times New Roman" w:hAnsi="Times New Roman"/>
+          <w:b w:val="0"/>
+          <w:i w:val="0"/>
+          <w:sz w:val="23"/>
+        </w:rPr>
+        <w:t xml:space="preserve"> Ở đậu Hà Lan, lai cây hoa tím thuần chủng với cây hoa trắng thuần chủng, biết hoa tím trội hoàn toàn so với hoa trắng. F</w:t>
+      </w:r>
+      <w:r>
+        <w:rPr>
+          <w:rFonts w:ascii="Times New Roman" w:hAnsi="Times New Roman"/>
+          <w:b w:val="0"/>
+          <w:i w:val="0"/>
+          <w:sz w:val="23"/>
+          <w:vertAlign w:val="subscript"/>
+        </w:rPr>
+        <w:t>1</w:t>
+      </w:r>
+      <w:r>
+        <w:rPr>
+          <w:rFonts w:ascii="Times New Roman" w:hAnsi="Times New Roman"/>
+          <w:b w:val="0"/>
+          <w:i w:val="0"/>
+          <w:sz w:val="23"/>
+        </w:rPr>
+        <w:t xml:space="preserve"> có 100% hoa tím. Hỏi tỉ lệ cây hoa trắng ở F</w:t>
+      </w:r>
+      <w:r>
+        <w:rPr>
+          <w:rFonts w:ascii="Times New Roman" w:hAnsi="Times New Roman"/>
+          <w:b w:val="0"/>
+          <w:i w:val="0"/>
+          <w:sz w:val="23"/>
+          <w:vertAlign w:val="subscript"/>
+        </w:rPr>
+        <w:t>2</w:t>
+      </w:r>
+      <w:r>
+        <w:rPr>
+          <w:rFonts w:ascii="Times New Roman" w:hAnsi="Times New Roman"/>
+          <w:b w:val="0"/>
+          <w:i w:val="0"/>
+          <w:sz w:val="23"/>
+        </w:rPr>
+        <w:t xml:space="preserve"> là bao nhiêu phần trăm?</w:t>
+      </w:r>
+    </w:p>
+    <w:p>
+      <w:pPr>
+        <w:spacing w:before="60" w:after="100"/>
+        <w:ind w:left="283"/>
+        <w:pBdr>
+          <w:top w:val="dashed" w:sz="4" w:space="4" w:color="B0BEC5"/>
+          <w:bottom w:val="dashed" w:sz="4" w:space="4" w:color="B0BEC5"/>
+          <w:left w:val="single" w:sz="12" w:space="6" w:color="7E57C2"/>
+        </w:pBdr>
+      </w:pPr>
+      <w:r>
+        <w:rPr>
+          <w:rFonts w:ascii="Times New Roman" w:hAnsi="Times New Roman"/>
+          <w:b/>
+          <w:i w:val="0"/>
+          <w:color w:val="6A1B9A"/>
+          <w:sz w:val="19"/>
+        </w:rPr>
+        <w:t>✎ Ghi chú &amp; Lời giải trực tiếp trên màn hình:</w:t>
+        <w:br/>
+      </w:r>
+      <w:r>
+        <w:br/>
+      </w:r>
+      <w:r>
+        <w:br/>
+      </w:r>
+      <w:r>
+        <w:br/>
+      </w:r>
+    </w:p>
+    <w:p>
+      <w:pPr>
+        <w:keepNext/>
+        <w:spacing w:before="60" w:after="40" w:line="276" w:lineRule="auto"/>
+      </w:pPr>
+      <w:r>
+        <w:rPr>
+          <w:rFonts w:ascii="Times New Roman" w:hAnsi="Times New Roman"/>
+          <w:b/>
+          <w:i w:val="0"/>
+          <w:color w:val="C62828"/>
+          <w:sz w:val="23"/>
+        </w:rPr>
+        <w:t>Câu 2.</w:t>
+      </w:r>
+      <w:r>
+        <w:rPr>
+          <w:rFonts w:ascii="Times New Roman" w:hAnsi="Times New Roman"/>
+          <w:b w:val="0"/>
+          <w:i w:val="0"/>
+          <w:sz w:val="23"/>
+        </w:rPr>
+        <w:t xml:space="preserve"> Cho hai cây F</w:t>
+      </w:r>
+      <w:r>
+        <w:rPr>
+          <w:rFonts w:ascii="Times New Roman" w:hAnsi="Times New Roman"/>
+          <w:b w:val="0"/>
+          <w:i w:val="0"/>
+          <w:sz w:val="23"/>
+          <w:vertAlign w:val="subscript"/>
+        </w:rPr>
+        <w:t>1</w:t>
+      </w:r>
+      <w:r>
+        <w:rPr>
+          <w:rFonts w:ascii="Times New Roman" w:hAnsi="Times New Roman"/>
+          <w:b w:val="0"/>
+          <w:i w:val="0"/>
+          <w:sz w:val="23"/>
+        </w:rPr>
+        <w:t xml:space="preserve"> dị hợp về một cặp gene lai với nhau (Aa × Aa). Hỏi đời con có bao nhiêu kiểu gene khác nhau?</w:t>
+      </w:r>
+    </w:p>
+    <w:p>
+      <w:pPr>
+        <w:spacing w:before="60" w:after="100"/>
+        <w:ind w:left="283"/>
+        <w:pBdr>
+          <w:top w:val="dashed" w:sz="4" w:space="4" w:color="B0BEC5"/>
+          <w:bottom w:val="dashed" w:sz="4" w:space="4" w:color="B0BEC5"/>
+          <w:left w:val="single" w:sz="12" w:space="6" w:color="7E57C2"/>
+        </w:pBdr>
+      </w:pPr>
+      <w:r>
+        <w:rPr>
+          <w:rFonts w:ascii="Times New Roman" w:hAnsi="Times New Roman"/>
+          <w:b/>
+          <w:i w:val="0"/>
+          <w:color w:val="6A1B9A"/>
+          <w:sz w:val="19"/>
+        </w:rPr>
+        <w:t>✎ Ghi chú &amp; Lời giải trực tiếp trên màn hình:</w:t>
+        <w:br/>
+      </w:r>
+      <w:r>
+        <w:br/>
+      </w:r>
+      <w:r>
+        <w:br/>
+      </w:r>
+      <w:r>
+        <w:br/>
+      </w:r>
+    </w:p>
+    <w:p>
+      <w:pPr>
+        <w:keepNext/>
+        <w:spacing w:before="60" w:after="40" w:line="276" w:lineRule="auto"/>
+      </w:pPr>
+      <w:r>
+        <w:rPr>
+          <w:rFonts w:ascii="Times New Roman" w:hAnsi="Times New Roman"/>
+          <w:b/>
+          <w:i w:val="0"/>
+          <w:color w:val="C62828"/>
+          <w:sz w:val="23"/>
+        </w:rPr>
+        <w:t>Câu 3.</w:t>
+      </w:r>
+      <w:r>
+        <w:rPr>
+          <w:rFonts w:ascii="Times New Roman" w:hAnsi="Times New Roman"/>
+          <w:b w:val="0"/>
+          <w:i w:val="0"/>
+          <w:sz w:val="23"/>
+        </w:rPr>
+        <w:t xml:space="preserve"> Phép lai Aa × Aa tạo ra đời con có tỉ lệ kiểu hình 3 trội : 1 lặn. Hỏi tỉ lệ kiểu hình trội là bao nhiêu phần trăm?</w:t>
+      </w:r>
+    </w:p>
+    <w:p>
+      <w:pPr>
+        <w:spacing w:before="60" w:after="100"/>
+        <w:ind w:left="283"/>
+        <w:pBdr>
+          <w:top w:val="dashed" w:sz="4" w:space="4" w:color="B0BEC5"/>
+          <w:bottom w:val="dashed" w:sz="4" w:space="4" w:color="B0BEC5"/>
+          <w:left w:val="single" w:sz="12" w:space="6" w:color="7E57C2"/>
+        </w:pBdr>
+      </w:pPr>
+      <w:r>
+        <w:rPr>
+          <w:rFonts w:ascii="Times New Roman" w:hAnsi="Times New Roman"/>
+          <w:b/>
+          <w:i w:val="0"/>
+          <w:color w:val="6A1B9A"/>
+          <w:sz w:val="19"/>
+        </w:rPr>
+        <w:t>✎ Ghi chú &amp; Lời giải trực tiếp trên màn hình:</w:t>
+        <w:br/>
+      </w:r>
+      <w:r>
+        <w:br/>
+      </w:r>
+      <w:r>
+        <w:br/>
+      </w:r>
+      <w:r>
+        <w:br/>
+      </w:r>
+    </w:p>
+    <w:p>
+      <w:pPr>
+        <w:keepNext/>
+        <w:spacing w:before="60" w:after="40" w:line="276" w:lineRule="auto"/>
+      </w:pPr>
+      <w:r>
+        <w:rPr>
+          <w:rFonts w:ascii="Times New Roman" w:hAnsi="Times New Roman"/>
+          <w:b/>
+          <w:i w:val="0"/>
+          <w:color w:val="C62828"/>
+          <w:sz w:val="23"/>
+        </w:rPr>
+        <w:t>Câu 4.</w:t>
+      </w:r>
+      <w:r>
+        <w:rPr>
+          <w:rFonts w:ascii="Times New Roman" w:hAnsi="Times New Roman"/>
+          <w:b w:val="0"/>
+          <w:i w:val="0"/>
+          <w:sz w:val="23"/>
+        </w:rPr>
+        <w:t xml:space="preserve"> Một cơ thể có kiểu gene Aa giảm phân bình thường. Hỏi cơ thể đó tạo ra bao nhiêu loại giao tử về gene đang xét?</w:t>
+      </w:r>
+    </w:p>
+    <w:p>
+      <w:pPr>
+        <w:spacing w:before="60" w:after="100"/>
+        <w:ind w:left="283"/>
+        <w:pBdr>
+          <w:top w:val="dashed" w:sz="4" w:space="4" w:color="B0BEC5"/>
+          <w:bottom w:val="dashed" w:sz="4" w:space="4" w:color="B0BEC5"/>
+          <w:left w:val="single" w:sz="12" w:space="6" w:color="7E57C2"/>
+        </w:pBdr>
+      </w:pPr>
+      <w:r>
+        <w:rPr>
+          <w:rFonts w:ascii="Times New Roman" w:hAnsi="Times New Roman"/>
+          <w:b/>
+          <w:i w:val="0"/>
+          <w:color w:val="6A1B9A"/>
+          <w:sz w:val="19"/>
+        </w:rPr>
+        <w:t>✎ Ghi chú &amp; Lời giải trực tiếp trên màn hình:</w:t>
+        <w:br/>
+      </w:r>
+      <w:r>
+        <w:br/>
+      </w:r>
+      <w:r>
+        <w:br/>
+      </w:r>
+      <w:r>
+        <w:br/>
+      </w:r>
+    </w:p>
+    <w:p>
+      <w:pPr>
+        <w:keepNext/>
+        <w:spacing w:before="60" w:after="40" w:line="276" w:lineRule="auto"/>
+      </w:pPr>
+      <w:r>
+        <w:rPr>
+          <w:rFonts w:ascii="Times New Roman" w:hAnsi="Times New Roman"/>
+          <w:b/>
+          <w:i w:val="0"/>
+          <w:color w:val="C62828"/>
+          <w:sz w:val="23"/>
+        </w:rPr>
+        <w:t>Câu 5.</w:t>
+      </w:r>
+      <w:r>
+        <w:rPr>
+          <w:rFonts w:ascii="Times New Roman" w:hAnsi="Times New Roman"/>
+          <w:b w:val="0"/>
+          <w:i w:val="0"/>
+          <w:sz w:val="23"/>
+        </w:rPr>
+        <w:t xml:space="preserve"> Một cơ thể có kiểu gene AaBb, hai cặp gene phân li độc lập và trội hoàn toàn. Hỏi cơ thể đó tạo ra bao nhiêu loại giao tử?</w:t>
+      </w:r>
+    </w:p>
+    <w:p>
+      <w:pPr>
+        <w:spacing w:before="60" w:after="100"/>
+        <w:ind w:left="283"/>
+        <w:pBdr>
+          <w:top w:val="dashed" w:sz="4" w:space="4" w:color="B0BEC5"/>
+          <w:bottom w:val="dashed" w:sz="4" w:space="4" w:color="B0BEC5"/>
+          <w:left w:val="single" w:sz="12" w:space="6" w:color="7E57C2"/>
+        </w:pBdr>
+      </w:pPr>
+      <w:r>
+        <w:rPr>
+          <w:rFonts w:ascii="Times New Roman" w:hAnsi="Times New Roman"/>
+          <w:b/>
+          <w:i w:val="0"/>
+          <w:color w:val="6A1B9A"/>
+          <w:sz w:val="19"/>
+        </w:rPr>
+        <w:t>✎ Ghi chú &amp; Lời giải trực tiếp trên màn hình:</w:t>
+        <w:br/>
+      </w:r>
+      <w:r>
+        <w:br/>
+      </w:r>
+      <w:r>
+        <w:br/>
+      </w:r>
+      <w:r>
+        <w:br/>
+      </w:r>
+    </w:p>
+    <w:p>
+      <w:pPr>
+        <w:keepNext/>
+        <w:spacing w:before="60" w:after="40" w:line="276" w:lineRule="auto"/>
+      </w:pPr>
+      <w:r>
+        <w:rPr>
+          <w:rFonts w:ascii="Times New Roman" w:hAnsi="Times New Roman"/>
+          <w:b/>
+          <w:i w:val="0"/>
+          <w:color w:val="C62828"/>
+          <w:sz w:val="23"/>
+        </w:rPr>
+        <w:t>Câu 6.</w:t>
+      </w:r>
+      <w:r>
+        <w:rPr>
+          <w:rFonts w:ascii="Times New Roman" w:hAnsi="Times New Roman"/>
+          <w:b w:val="0"/>
+          <w:i w:val="0"/>
+          <w:sz w:val="23"/>
+        </w:rPr>
+        <w:t xml:space="preserve"> Một phép lai phân tích giữa cơ thể Aa và cơ thể aa tạo ra đời con có tỉ lệ kiểu hình trội : kiểu hình lặn là 1 : 1. Hỏi tỉ lệ phần trăm đời con mang kiểu hình lặn là bao nhiêu?</w:t>
+      </w:r>
+    </w:p>
+    <w:p>
+      <w:pPr>
+        <w:spacing w:before="60" w:after="100"/>
+        <w:ind w:left="283"/>
+        <w:pBdr>
+          <w:top w:val="dashed" w:sz="4" w:space="4" w:color="B0BEC5"/>
+          <w:bottom w:val="dashed" w:sz="4" w:space="4" w:color="B0BEC5"/>
+          <w:left w:val="single" w:sz="12" w:space="6" w:color="7E57C2"/>
+        </w:pBdr>
+      </w:pPr>
+      <w:r>
+        <w:rPr>
+          <w:rFonts w:ascii="Times New Roman" w:hAnsi="Times New Roman"/>
+          <w:b/>
+          <w:i w:val="0"/>
+          <w:color w:val="6A1B9A"/>
+          <w:sz w:val="19"/>
+        </w:rPr>
+        <w:t>✎ Ghi chú &amp; Lời giải trực tiếp trên màn hình:</w:t>
+        <w:br/>
+      </w:r>
+      <w:r>
+        <w:br/>
+      </w:r>
+      <w:r>
+        <w:br/>
+      </w:r>
+      <w:r>
+        <w:br/>
+      </w:r>
+    </w:p>
+    <w:p>
+      <w:pPr>
+        <w:keepNext/>
+        <w:spacing w:before="60" w:after="40" w:line="276" w:lineRule="auto"/>
+      </w:pPr>
+      <w:r>
+        <w:rPr>
+          <w:rFonts w:ascii="Times New Roman" w:hAnsi="Times New Roman"/>
+          <w:b/>
+          <w:i w:val="0"/>
+          <w:color w:val="C62828"/>
+          <w:sz w:val="23"/>
+        </w:rPr>
+        <w:t>Câu 7.</w:t>
+      </w:r>
+      <w:r>
+        <w:rPr>
+          <w:rFonts w:ascii="Times New Roman" w:hAnsi="Times New Roman"/>
+          <w:b w:val="0"/>
+          <w:i w:val="0"/>
+          <w:sz w:val="23"/>
+        </w:rPr>
+        <w:t xml:space="preserve"> Một cơ thể có kiểu gene AaBb, hai cặp gene phân li độc lập. Hỏi cơ thể đó có bao nhiêu loại kiểu gene trong các giao tử được tạo ra?</w:t>
+      </w:r>
+    </w:p>
+    <w:p>
+      <w:pPr>
+        <w:spacing w:before="60" w:after="100"/>
+        <w:ind w:left="283"/>
+        <w:pBdr>
+          <w:top w:val="dashed" w:sz="4" w:space="4" w:color="B0BEC5"/>
+          <w:bottom w:val="dashed" w:sz="4" w:space="4" w:color="B0BEC5"/>
+          <w:left w:val="single" w:sz="12" w:space="6" w:color="7E57C2"/>
+        </w:pBdr>
+      </w:pPr>
+      <w:r>
+        <w:rPr>
+          <w:rFonts w:ascii="Times New Roman" w:hAnsi="Times New Roman"/>
+          <w:b/>
+          <w:i w:val="0"/>
+          <w:color w:val="6A1B9A"/>
+          <w:sz w:val="19"/>
+        </w:rPr>
+        <w:t>✎ Ghi chú &amp; Lời giải trực tiếp trên màn hình:</w:t>
+        <w:br/>
+      </w:r>
+      <w:r>
+        <w:br/>
+      </w:r>
+      <w:r>
+        <w:br/>
+      </w:r>
+      <w:r>
+        <w:br/>
+      </w:r>
+    </w:p>
+    <w:p>
+      <w:pPr>
+        <w:keepNext/>
+        <w:spacing w:before="60" w:after="40" w:line="276" w:lineRule="auto"/>
+      </w:pPr>
+      <w:r>
+        <w:rPr>
+          <w:rFonts w:ascii="Times New Roman" w:hAnsi="Times New Roman"/>
+          <w:b/>
+          <w:i w:val="0"/>
+          <w:color w:val="C62828"/>
+          <w:sz w:val="23"/>
+        </w:rPr>
+        <w:t>Câu 8.</w:t>
+      </w:r>
+      <w:r>
+        <w:rPr>
+          <w:rFonts w:ascii="Times New Roman" w:hAnsi="Times New Roman"/>
+          <w:b w:val="0"/>
+          <w:i w:val="0"/>
+          <w:sz w:val="23"/>
+        </w:rPr>
+        <w:t xml:space="preserve"> Một phân tử DNA có 1.000 cặp nucleotide. Hỏi phân tử DNA đó có tổng cộng bao nhiêu nucleotide?</w:t>
+      </w:r>
+    </w:p>
+    <w:p>
+      <w:pPr>
+        <w:spacing w:before="60" w:after="100"/>
+        <w:ind w:left="283"/>
+        <w:pBdr>
+          <w:top w:val="dashed" w:sz="4" w:space="4" w:color="B0BEC5"/>
+          <w:bottom w:val="dashed" w:sz="4" w:space="4" w:color="B0BEC5"/>
+          <w:left w:val="single" w:sz="12" w:space="6" w:color="7E57C2"/>
+        </w:pBdr>
+      </w:pPr>
+      <w:r>
+        <w:rPr>
+          <w:rFonts w:ascii="Times New Roman" w:hAnsi="Times New Roman"/>
+          <w:b/>
+          <w:i w:val="0"/>
+          <w:color w:val="6A1B9A"/>
+          <w:sz w:val="19"/>
+        </w:rPr>
+        <w:t>✎ Ghi chú &amp; Lời giải trực tiếp trên màn hình:</w:t>
+        <w:br/>
+      </w:r>
+      <w:r>
+        <w:br/>
+      </w:r>
+      <w:r>
+        <w:br/>
+      </w:r>
+      <w:r>
+        <w:br/>
+      </w:r>
+    </w:p>
+    <w:p>
+      <w:pPr>
+        <w:keepNext/>
+        <w:spacing w:before="60" w:after="40" w:line="276" w:lineRule="auto"/>
+      </w:pPr>
+      <w:r>
+        <w:rPr>
+          <w:rFonts w:ascii="Times New Roman" w:hAnsi="Times New Roman"/>
+          <w:b/>
+          <w:i w:val="0"/>
+          <w:color w:val="C62828"/>
+          <w:sz w:val="23"/>
+        </w:rPr>
+        <w:t>Câu 9.</w:t>
+      </w:r>
+      <w:r>
+        <w:rPr>
+          <w:rFonts w:ascii="Times New Roman" w:hAnsi="Times New Roman"/>
+          <w:b w:val="0"/>
+          <w:i w:val="0"/>
+          <w:sz w:val="23"/>
+        </w:rPr>
+        <w:t xml:space="preserve"> Một phân tử DNA có 2.000 nucleotide, trong đó có 400 nucleotide loại A. Hỏi phân tử DNA đó có bao nhiêu nucleotide loại T?</w:t>
+      </w:r>
+    </w:p>
+    <w:p>
+      <w:pPr>
+        <w:spacing w:before="60" w:after="100"/>
+        <w:ind w:left="283"/>
+        <w:pBdr>
+          <w:top w:val="dashed" w:sz="4" w:space="4" w:color="B0BEC5"/>
+          <w:bottom w:val="dashed" w:sz="4" w:space="4" w:color="B0BEC5"/>
+          <w:left w:val="single" w:sz="12" w:space="6" w:color="7E57C2"/>
+        </w:pBdr>
+      </w:pPr>
+      <w:r>
+        <w:rPr>
+          <w:rFonts w:ascii="Times New Roman" w:hAnsi="Times New Roman"/>
+          <w:b/>
+          <w:i w:val="0"/>
+          <w:color w:val="6A1B9A"/>
+          <w:sz w:val="19"/>
+        </w:rPr>
+        <w:t>✎ Ghi chú &amp; Lời giải trực tiếp trên màn hình:</w:t>
+        <w:br/>
+      </w:r>
+      <w:r>
+        <w:br/>
+      </w:r>
+      <w:r>
+        <w:br/>
+      </w:r>
+      <w:r>
+        <w:br/>
+      </w:r>
+    </w:p>
+    <w:p>
+      <w:pPr>
+        <w:keepNext/>
+        <w:spacing w:before="60" w:after="40" w:line="276" w:lineRule="auto"/>
+      </w:pPr>
+      <w:r>
+        <w:rPr>
+          <w:rFonts w:ascii="Times New Roman" w:hAnsi="Times New Roman"/>
+          <w:b/>
+          <w:i w:val="0"/>
+          <w:color w:val="C62828"/>
+          <w:sz w:val="23"/>
+        </w:rPr>
+        <w:t>Câu 10.</w:t>
+      </w:r>
+      <w:r>
+        <w:rPr>
+          <w:rFonts w:ascii="Times New Roman" w:hAnsi="Times New Roman"/>
+          <w:b w:val="0"/>
+          <w:i w:val="0"/>
+          <w:sz w:val="23"/>
+        </w:rPr>
+        <w:t xml:space="preserve"> Một phân tử DNA có 2.000 nucleotide, trong đó có 400 nucleotide loại A. Hỏi tổng số nucleotide loại G và C là bao nhiêu?</w:t>
+      </w:r>
+    </w:p>
+    <w:p>
+      <w:pPr>
+        <w:spacing w:before="60" w:after="100"/>
+        <w:ind w:left="283"/>
+        <w:pBdr>
+          <w:top w:val="dashed" w:sz="4" w:space="4" w:color="B0BEC5"/>
+          <w:bottom w:val="dashed" w:sz="4" w:space="4" w:color="B0BEC5"/>
+          <w:left w:val="single" w:sz="12" w:space="6" w:color="7E57C2"/>
+        </w:pBdr>
+      </w:pPr>
+      <w:r>
+        <w:rPr>
+          <w:rFonts w:ascii="Times New Roman" w:hAnsi="Times New Roman"/>
+          <w:b/>
+          <w:i w:val="0"/>
+          <w:color w:val="6A1B9A"/>
+          <w:sz w:val="19"/>
+        </w:rPr>
+        <w:t>✎ Ghi chú &amp; Lời giải trực tiếp trên màn hình:</w:t>
+        <w:br/>
+      </w:r>
+      <w:r>
+        <w:br/>
+      </w:r>
+      <w:r>
+        <w:br/>
+      </w:r>
+      <w:r>
+        <w:br/>
+      </w:r>
+    </w:p>
+    <w:p>
+      <w:pPr>
+        <w:keepNext/>
+        <w:spacing w:before="60" w:after="40" w:line="276" w:lineRule="auto"/>
+      </w:pPr>
+      <w:r>
+        <w:rPr>
+          <w:rFonts w:ascii="Times New Roman" w:hAnsi="Times New Roman"/>
+          <w:b/>
+          <w:i w:val="0"/>
+          <w:color w:val="C62828"/>
+          <w:sz w:val="23"/>
+        </w:rPr>
+        <w:t>Câu 11.</w:t>
+      </w:r>
+      <w:r>
+        <w:rPr>
+          <w:rFonts w:ascii="Times New Roman" w:hAnsi="Times New Roman"/>
+          <w:b w:val="0"/>
+          <w:i w:val="0"/>
+          <w:sz w:val="23"/>
+        </w:rPr>
+        <w:t xml:space="preserve"> Một phân tử DNA có 1.500 cặp nucleotide. Theo mô hình cấu trúc phổ biến, cứ 10 cặp nucleotide tương ứng với một chu kì xoắn. Hỏi phân tử DNA đó có bao nhiêu chu kì xoắn?</w:t>
+      </w:r>
+    </w:p>
+    <w:p>
+      <w:pPr>
+        <w:spacing w:before="60" w:after="100"/>
+        <w:ind w:left="283"/>
+        <w:pBdr>
+          <w:top w:val="dashed" w:sz="4" w:space="4" w:color="B0BEC5"/>
+          <w:bottom w:val="dashed" w:sz="4" w:space="4" w:color="B0BEC5"/>
+          <w:left w:val="single" w:sz="12" w:space="6" w:color="7E57C2"/>
+        </w:pBdr>
+      </w:pPr>
+      <w:r>
+        <w:rPr>
+          <w:rFonts w:ascii="Times New Roman" w:hAnsi="Times New Roman"/>
+          <w:b/>
+          <w:i w:val="0"/>
+          <w:color w:val="6A1B9A"/>
+          <w:sz w:val="19"/>
+        </w:rPr>
+        <w:t>✎ Ghi chú &amp; Lời giải trực tiếp trên màn hình:</w:t>
+        <w:br/>
+      </w:r>
+      <w:r>
+        <w:br/>
+      </w:r>
+      <w:r>
+        <w:br/>
+      </w:r>
+      <w:r>
+        <w:br/>
+      </w:r>
+    </w:p>
+    <w:p>
+      <w:pPr>
+        <w:keepNext/>
+        <w:spacing w:before="60" w:after="40" w:line="276" w:lineRule="auto"/>
+      </w:pPr>
+      <w:r>
+        <w:rPr>
+          <w:rFonts w:ascii="Times New Roman" w:hAnsi="Times New Roman"/>
+          <w:b/>
+          <w:i w:val="0"/>
+          <w:color w:val="C62828"/>
+          <w:sz w:val="23"/>
+        </w:rPr>
+        <w:t>Câu 12.</w:t>
+      </w:r>
+      <w:r>
+        <w:rPr>
+          <w:rFonts w:ascii="Times New Roman" w:hAnsi="Times New Roman"/>
+          <w:b w:val="0"/>
+          <w:i w:val="0"/>
+          <w:sz w:val="23"/>
+        </w:rPr>
+        <w:t xml:space="preserve"> Một phân tử DNA có 20 chu kì xoắn. Biết mỗi chu kì xoắn gồm 10 cặp nucleotide. Hỏi phân tử DNA đó có tổng cộng bao nhiêu nucleotide?</w:t>
+      </w:r>
+    </w:p>
+    <w:p>
+      <w:pPr>
+        <w:spacing w:before="60" w:after="100"/>
+        <w:ind w:left="283"/>
+        <w:pBdr>
+          <w:top w:val="dashed" w:sz="4" w:space="4" w:color="B0BEC5"/>
+          <w:bottom w:val="dashed" w:sz="4" w:space="4" w:color="B0BEC5"/>
+          <w:left w:val="single" w:sz="12" w:space="6" w:color="7E57C2"/>
+        </w:pBdr>
+      </w:pPr>
+      <w:r>
+        <w:rPr>
+          <w:rFonts w:ascii="Times New Roman" w:hAnsi="Times New Roman"/>
+          <w:b/>
+          <w:i w:val="0"/>
+          <w:color w:val="6A1B9A"/>
+          <w:sz w:val="19"/>
+        </w:rPr>
+        <w:t>✎ Ghi chú &amp; Lời giải trực tiếp trên màn hình:</w:t>
+        <w:br/>
+      </w:r>
+      <w:r>
+        <w:br/>
+      </w:r>
+      <w:r>
+        <w:br/>
+      </w:r>
+      <w:r>
+        <w:br/>
+      </w:r>
+    </w:p>
+    <w:p>
+      <w:pPr>
+        <w:keepNext/>
+        <w:spacing w:before="60" w:after="40" w:line="276" w:lineRule="auto"/>
+      </w:pPr>
+      <w:r>
+        <w:rPr>
+          <w:rFonts w:ascii="Times New Roman" w:hAnsi="Times New Roman"/>
+          <w:b/>
+          <w:i w:val="0"/>
+          <w:color w:val="C62828"/>
+          <w:sz w:val="23"/>
+        </w:rPr>
+        <w:t>Câu 13.</w:t>
+      </w:r>
+      <w:r>
+        <w:rPr>
+          <w:rFonts w:ascii="Times New Roman" w:hAnsi="Times New Roman"/>
+          <w:b w:val="0"/>
+          <w:i w:val="0"/>
+          <w:sz w:val="23"/>
+        </w:rPr>
+        <w:t xml:space="preserve"> Một phân tử DNA có 1.000 cặp nucleotide, trong đó có 200 nucleotide loại G. Hỏi phân tử DNA đó có bao nhiêu nucleotide loại A?</w:t>
+      </w:r>
+    </w:p>
+    <w:p>
+      <w:pPr>
+        <w:spacing w:before="60" w:after="100"/>
+        <w:ind w:left="283"/>
+        <w:pBdr>
+          <w:top w:val="dashed" w:sz="4" w:space="4" w:color="B0BEC5"/>
+          <w:bottom w:val="dashed" w:sz="4" w:space="4" w:color="B0BEC5"/>
+          <w:left w:val="single" w:sz="12" w:space="6" w:color="7E57C2"/>
+        </w:pBdr>
+      </w:pPr>
+      <w:r>
+        <w:rPr>
+          <w:rFonts w:ascii="Times New Roman" w:hAnsi="Times New Roman"/>
+          <w:b/>
+          <w:i w:val="0"/>
+          <w:color w:val="6A1B9A"/>
+          <w:sz w:val="19"/>
+        </w:rPr>
+        <w:t>✎ Ghi chú &amp; Lời giải trực tiếp trên màn hình:</w:t>
+        <w:br/>
+      </w:r>
+      <w:r>
+        <w:br/>
+      </w:r>
+      <w:r>
+        <w:br/>
+      </w:r>
+      <w:r>
+        <w:br/>
+      </w:r>
+    </w:p>
+    <w:p>
+      <w:pPr>
+        <w:keepNext/>
+        <w:spacing w:before="60" w:after="40" w:line="276" w:lineRule="auto"/>
+      </w:pPr>
+      <w:r>
+        <w:rPr>
+          <w:rFonts w:ascii="Times New Roman" w:hAnsi="Times New Roman"/>
+          <w:b/>
+          <w:i w:val="0"/>
+          <w:color w:val="C62828"/>
+          <w:sz w:val="23"/>
+        </w:rPr>
+        <w:t>Câu 14.</w:t>
+      </w:r>
+      <w:r>
+        <w:rPr>
+          <w:rFonts w:ascii="Times New Roman" w:hAnsi="Times New Roman"/>
+          <w:b w:val="0"/>
+          <w:i w:val="0"/>
+          <w:sz w:val="23"/>
+        </w:rPr>
+        <w:t xml:space="preserve"> RNA có 4 loại nucleotide khác nhau. Hỏi có bao nhiêu loại nucleotide của RNA không có trong DNA?</w:t>
+      </w:r>
+    </w:p>
+    <w:p>
+      <w:pPr>
+        <w:spacing w:before="60" w:after="100"/>
+        <w:ind w:left="283"/>
+        <w:pBdr>
+          <w:top w:val="dashed" w:sz="4" w:space="4" w:color="B0BEC5"/>
+          <w:bottom w:val="dashed" w:sz="4" w:space="4" w:color="B0BEC5"/>
+          <w:left w:val="single" w:sz="12" w:space="6" w:color="7E57C2"/>
+        </w:pBdr>
+      </w:pPr>
+      <w:r>
+        <w:rPr>
+          <w:rFonts w:ascii="Times New Roman" w:hAnsi="Times New Roman"/>
+          <w:b/>
+          <w:i w:val="0"/>
+          <w:color w:val="6A1B9A"/>
+          <w:sz w:val="19"/>
+        </w:rPr>
+        <w:t>✎ Ghi chú &amp; Lời giải trực tiếp trên màn hình:</w:t>
+        <w:br/>
+      </w:r>
+      <w:r>
+        <w:br/>
+      </w:r>
+      <w:r>
+        <w:br/>
+      </w:r>
+      <w:r>
+        <w:br/>
+      </w:r>
+    </w:p>
+    <w:p>
+      <w:pPr>
+        <w:keepNext/>
+        <w:spacing w:before="60" w:after="40" w:line="276" w:lineRule="auto"/>
+      </w:pPr>
+      <w:r>
+        <w:rPr>
+          <w:rFonts w:ascii="Times New Roman" w:hAnsi="Times New Roman"/>
+          <w:b/>
+          <w:i w:val="0"/>
+          <w:color w:val="C62828"/>
+          <w:sz w:val="23"/>
+        </w:rPr>
+        <w:t>Câu 15.</w:t>
+      </w:r>
+      <w:r>
+        <w:rPr>
+          <w:rFonts w:ascii="Times New Roman" w:hAnsi="Times New Roman"/>
+          <w:b w:val="0"/>
+          <w:i w:val="0"/>
+          <w:sz w:val="23"/>
+        </w:rPr>
+        <w:t xml:space="preserve"> Một phân tử DNA có 800 nucleotide trên một mạch. Hỏi mạch còn lại có bao nhiêu nucleotide?</w:t>
+      </w:r>
+    </w:p>
+    <w:p>
+      <w:pPr>
+        <w:spacing w:before="60" w:after="100"/>
+        <w:ind w:left="283"/>
+        <w:pBdr>
+          <w:top w:val="dashed" w:sz="4" w:space="4" w:color="B0BEC5"/>
+          <w:bottom w:val="dashed" w:sz="4" w:space="4" w:color="B0BEC5"/>
+          <w:left w:val="single" w:sz="12" w:space="6" w:color="7E57C2"/>
+        </w:pBdr>
+      </w:pPr>
+      <w:r>
+        <w:rPr>
+          <w:rFonts w:ascii="Times New Roman" w:hAnsi="Times New Roman"/>
+          <w:b/>
+          <w:i w:val="0"/>
+          <w:color w:val="6A1B9A"/>
+          <w:sz w:val="19"/>
+        </w:rPr>
+        <w:t>✎ Ghi chú &amp; Lời giải trực tiếp trên màn hình:</w:t>
+        <w:br/>
+      </w:r>
+      <w:r>
+        <w:br/>
+      </w:r>
+      <w:r>
+        <w:br/>
+      </w:r>
+      <w:r>
+        <w:br/>
+      </w:r>
+    </w:p>
+    <w:p>
+      <w:pPr>
+        <w:keepNext/>
+        <w:spacing w:before="140" w:after="40"/>
+      </w:pPr>
+      <w:r>
+        <w:rPr>
+          <w:rFonts w:ascii="Times New Roman" w:hAnsi="Times New Roman"/>
+          <w:b/>
+          <w:i w:val="0"/>
+          <w:color w:val="2E7D32"/>
+          <w:sz w:val="23"/>
+        </w:rPr>
+        <w:t>III. Tự luận Sinh học: Sơ đồ lai &amp; Cấu trúc phân tử DNA (4 câu)</w:t>
+      </w:r>
+    </w:p>
+    <w:p>
+      <w:pPr>
+        <w:keepNext/>
+        <w:spacing w:before="80" w:after="40" w:line="276" w:lineRule="auto"/>
+      </w:pPr>
+      <w:r>
+        <w:rPr>
+          <w:rFonts w:ascii="Times New Roman" w:hAnsi="Times New Roman"/>
+          <w:b/>
+          <w:i w:val="0"/>
+          <w:color w:val="C62828"/>
+          <w:sz w:val="23"/>
+        </w:rPr>
+        <w:t>Câu 1.</w:t>
+      </w:r>
+      <w:r>
+        <w:rPr>
+          <w:rFonts w:ascii="Times New Roman" w:hAnsi="Times New Roman"/>
+          <w:b w:val="0"/>
+          <w:i w:val="0"/>
+          <w:sz w:val="23"/>
+        </w:rPr>
+        <w:t xml:space="preserve"> Ở bí, tính trạng quả tròn trội hoàn toàn so với tính trạng quả dài. Cho giao phấn giữa cây có quả tròn với cây có quả dài thu được F</w:t>
+      </w:r>
+      <w:r>
+        <w:rPr>
+          <w:rFonts w:ascii="Times New Roman" w:hAnsi="Times New Roman"/>
+          <w:b w:val="0"/>
+          <w:i w:val="0"/>
+          <w:sz w:val="23"/>
+          <w:vertAlign w:val="subscript"/>
+        </w:rPr>
+        <w:t>1</w:t>
+      </w:r>
+      <w:r>
+        <w:rPr>
+          <w:rFonts w:ascii="Times New Roman" w:hAnsi="Times New Roman"/>
+          <w:b w:val="0"/>
+          <w:i w:val="0"/>
+          <w:sz w:val="23"/>
+        </w:rPr>
+        <w:t xml:space="preserve"> rồi tiếp tục cho F</w:t>
+      </w:r>
+      <w:r>
+        <w:rPr>
+          <w:rFonts w:ascii="Times New Roman" w:hAnsi="Times New Roman"/>
+          <w:b w:val="0"/>
+          <w:i w:val="0"/>
+          <w:sz w:val="23"/>
+          <w:vertAlign w:val="subscript"/>
+        </w:rPr>
+        <w:t>1</w:t>
+      </w:r>
+      <w:r>
+        <w:rPr>
+          <w:rFonts w:ascii="Times New Roman" w:hAnsi="Times New Roman"/>
+          <w:b w:val="0"/>
+          <w:i w:val="0"/>
+          <w:sz w:val="23"/>
+        </w:rPr>
+        <w:t xml:space="preserve"> giao phấn với nhau.</w:t>
+        <w:br/>
+        <w:t>a. Lập sơ đồ lai từ P → F</w:t>
+      </w:r>
+      <w:r>
+        <w:rPr>
+          <w:rFonts w:ascii="Times New Roman" w:hAnsi="Times New Roman"/>
+          <w:b w:val="0"/>
+          <w:i w:val="0"/>
+          <w:sz w:val="23"/>
+          <w:vertAlign w:val="subscript"/>
+        </w:rPr>
+        <w:t>2</w:t>
+      </w:r>
+      <w:r>
+        <w:rPr>
+          <w:rFonts w:ascii="Times New Roman" w:hAnsi="Times New Roman"/>
+          <w:b w:val="0"/>
+          <w:i w:val="0"/>
+          <w:sz w:val="23"/>
+        </w:rPr>
+        <w:t>.</w:t>
+        <w:br/>
+        <w:t>b. Cho F</w:t>
+      </w:r>
+      <w:r>
+        <w:rPr>
+          <w:rFonts w:ascii="Times New Roman" w:hAnsi="Times New Roman"/>
+          <w:b w:val="0"/>
+          <w:i w:val="0"/>
+          <w:sz w:val="23"/>
+          <w:vertAlign w:val="subscript"/>
+        </w:rPr>
+        <w:t>1</w:t>
+      </w:r>
+      <w:r>
+        <w:rPr>
+          <w:rFonts w:ascii="Times New Roman" w:hAnsi="Times New Roman"/>
+          <w:b w:val="0"/>
+          <w:i w:val="0"/>
+          <w:sz w:val="23"/>
+        </w:rPr>
+        <w:t xml:space="preserve"> lai phân tích thì kết quả tạo ra sẽ như thế nào về kiểu gene và kiểu hình?</w:t>
+      </w:r>
+    </w:p>
+    <w:p>
+      <w:pPr>
+        <w:spacing w:before="60" w:after="100"/>
+        <w:ind w:left="283"/>
+        <w:pBdr>
+          <w:top w:val="dashed" w:sz="4" w:space="4" w:color="B0BEC5"/>
+          <w:bottom w:val="dashed" w:sz="4" w:space="4" w:color="B0BEC5"/>
+          <w:left w:val="single" w:sz="12" w:space="6" w:color="7E57C2"/>
+        </w:pBdr>
+      </w:pPr>
+      <w:r>
+        <w:rPr>
+          <w:rFonts w:ascii="Times New Roman" w:hAnsi="Times New Roman"/>
+          <w:b/>
+          <w:i w:val="0"/>
+          <w:color w:val="6A1B9A"/>
+          <w:sz w:val="19"/>
+        </w:rPr>
+        <w:t>✎ Ghi chú &amp; Lời giải trực tiếp trên màn hình:</w:t>
+        <w:br/>
+      </w:r>
+      <w:r>
+        <w:br/>
+      </w:r>
+      <w:r>
+        <w:br/>
+      </w:r>
+      <w:r>
+        <w:br/>
+      </w:r>
+      <w:r>
+        <w:br/>
+      </w:r>
+      <w:r>
+        <w:br/>
+      </w:r>
+    </w:p>
+    <w:p>
+      <w:pPr>
+        <w:keepNext/>
+        <w:spacing w:before="80" w:after="40" w:line="276" w:lineRule="auto"/>
+      </w:pPr>
+      <w:r>
+        <w:rPr>
+          <w:rFonts w:ascii="Times New Roman" w:hAnsi="Times New Roman"/>
+          <w:b/>
+          <w:i w:val="0"/>
+          <w:color w:val="C62828"/>
+          <w:sz w:val="23"/>
+        </w:rPr>
+        <w:t>Câu 2.</w:t>
+      </w:r>
+      <w:r>
+        <w:rPr>
+          <w:rFonts w:ascii="Times New Roman" w:hAnsi="Times New Roman"/>
+          <w:b w:val="0"/>
+          <w:i w:val="0"/>
+          <w:sz w:val="23"/>
+        </w:rPr>
+        <w:t xml:space="preserve"> Ở bí, quả tròn, hoa vàng là hai tính trạng trội hoàn toàn so với quả dài, hoa trắng. Sự di truyền của hai tính trạng trên tuân theo quy luật phân li độc lập của Mendel. Cho cây bí quả tròn, hoa vàng thuần chủng lai với cây bí quả dài, hoa trắng. Xác định kiểu gene, kiểu hình của P</w:t>
+      </w:r>
+      <w:r>
+        <w:rPr>
+          <w:rFonts w:ascii="Times New Roman" w:hAnsi="Times New Roman"/>
+          <w:b w:val="0"/>
+          <w:i w:val="0"/>
+          <w:sz w:val="23"/>
+          <w:vertAlign w:val="subscript"/>
+        </w:rPr>
+        <w:t>tc</w:t>
+      </w:r>
+      <w:r>
+        <w:rPr>
+          <w:rFonts w:ascii="Times New Roman" w:hAnsi="Times New Roman"/>
+          <w:b w:val="0"/>
+          <w:i w:val="0"/>
+          <w:sz w:val="23"/>
+        </w:rPr>
+        <w:t xml:space="preserve"> và lập sơ đồ lai từ P</w:t>
+      </w:r>
+      <w:r>
+        <w:rPr>
+          <w:rFonts w:ascii="Times New Roman" w:hAnsi="Times New Roman"/>
+          <w:b w:val="0"/>
+          <w:i w:val="0"/>
+          <w:sz w:val="23"/>
+          <w:vertAlign w:val="subscript"/>
+        </w:rPr>
+        <w:t>tc</w:t>
+      </w:r>
+      <w:r>
+        <w:rPr>
+          <w:rFonts w:ascii="Times New Roman" w:hAnsi="Times New Roman"/>
+          <w:b w:val="0"/>
+          <w:i w:val="0"/>
+          <w:sz w:val="23"/>
+        </w:rPr>
+        <w:t xml:space="preserve"> đến F</w:t>
+      </w:r>
+      <w:r>
+        <w:rPr>
+          <w:rFonts w:ascii="Times New Roman" w:hAnsi="Times New Roman"/>
+          <w:b w:val="0"/>
+          <w:i w:val="0"/>
+          <w:sz w:val="23"/>
+          <w:vertAlign w:val="subscript"/>
+        </w:rPr>
+        <w:t>2</w:t>
+      </w:r>
+      <w:r>
+        <w:rPr>
+          <w:rFonts w:ascii="Times New Roman" w:hAnsi="Times New Roman"/>
+          <w:b w:val="0"/>
+          <w:i w:val="0"/>
+          <w:sz w:val="23"/>
+        </w:rPr>
+        <w:t>.</w:t>
+      </w:r>
+    </w:p>
+    <w:p>
+      <w:pPr>
+        <w:spacing w:before="60" w:after="100"/>
+        <w:ind w:left="283"/>
+        <w:pBdr>
+          <w:top w:val="dashed" w:sz="4" w:space="4" w:color="B0BEC5"/>
+          <w:bottom w:val="dashed" w:sz="4" w:space="4" w:color="B0BEC5"/>
+          <w:left w:val="single" w:sz="12" w:space="6" w:color="7E57C2"/>
+        </w:pBdr>
+      </w:pPr>
+      <w:r>
+        <w:rPr>
+          <w:rFonts w:ascii="Times New Roman" w:hAnsi="Times New Roman"/>
+          <w:b/>
+          <w:i w:val="0"/>
+          <w:color w:val="6A1B9A"/>
+          <w:sz w:val="19"/>
+        </w:rPr>
+        <w:t>✎ Ghi chú &amp; Lời giải trực tiếp trên màn hình:</w:t>
+        <w:br/>
+      </w:r>
+      <w:r>
+        <w:br/>
+      </w:r>
+      <w:r>
+        <w:br/>
+      </w:r>
+      <w:r>
+        <w:br/>
+      </w:r>
+      <w:r>
+        <w:br/>
+      </w:r>
+      <w:r>
+        <w:br/>
+      </w:r>
+    </w:p>
+    <w:p>
+      <w:pPr>
+        <w:keepNext/>
+        <w:spacing w:before="80" w:after="40" w:line="276" w:lineRule="auto"/>
+      </w:pPr>
+      <w:r>
+        <w:rPr>
+          <w:rFonts w:ascii="Times New Roman" w:hAnsi="Times New Roman"/>
+          <w:b/>
+          <w:i w:val="0"/>
+          <w:color w:val="C62828"/>
+          <w:sz w:val="23"/>
+        </w:rPr>
+        <w:t>Câu 3.</w:t>
+      </w:r>
+      <w:r>
+        <w:rPr>
+          <w:rFonts w:ascii="Times New Roman" w:hAnsi="Times New Roman"/>
+          <w:b w:val="0"/>
+          <w:i w:val="0"/>
+          <w:sz w:val="23"/>
+        </w:rPr>
+        <w:t xml:space="preserve"> Dựa vào hình ảnh bên dưới (Hình 38.1 - Mô hình cấu trúc một đoạn phân tử DNA):</w:t>
+        <w:br/>
+        <w:t>a) Cho biết phân tử DNA có cấu trúc như thế nào?</w:t>
+        <w:br/>
+        <w:t>b) Gọi tên các đơn phân cấu tạo nên phân tử DNA và cho biết chúng liên kết với nhau bằng cách nào?</w:t>
+      </w:r>
+    </w:p>
+    <w:p>
+      <w:pPr>
+        <w:spacing w:before="60" w:after="20"/>
+        <w:jc w:val="center"/>
+      </w:pPr>
+      <w:r>
+        <w:drawing>
+          <wp:inline xmlns:a="http://schemas.openxmlformats.org/drawingml/2006/main" xmlns:pic="http://schemas.openxmlformats.org/drawingml/2006/picture">
+            <wp:extent cx="2340000" cy="3362069"/>
+            <wp:docPr id="1" name="Picture 1"/>
+            <wp:cNvGraphicFramePr>
+              <a:graphicFrameLocks noChangeAspect="1"/>
+            </wp:cNvGraphicFramePr>
+            <a:graphic>
+              <a:graphicData uri="http://schemas.openxmlformats.org/drawingml/2006/picture">
+                <pic:pic>
+                  <pic:nvPicPr>
+                    <pic:cNvPr id="0" name="hinh38_1_dna_hd.png"/>
+                    <pic:cNvPicPr/>
+                  </pic:nvPicPr>
+                  <pic:blipFill>
+                    <a:blip r:embed="rId11"/>
+                    <a:stretch>
+                      <a:fillRect/>
+                    </a:stretch>
+                  </pic:blipFill>
+                  <pic:spPr>
+                    <a:xfrm>
+                      <a:off x="0" y="0"/>
+                      <a:ext cx="2340000" cy="3362069"/>
+                    </a:xfrm>
+                    <a:prstGeom prst="rect"/>
+                  </pic:spPr>
+                </pic:pic>
+              </a:graphicData>
+            </a:graphic>
+          </wp:inline>
+        </w:drawing>
+      </w:r>
+    </w:p>
+    <w:p>
+      <w:pPr>
+        <w:spacing w:before="0" w:after="60"/>
+        <w:jc w:val="center"/>
+      </w:pPr>
+      <w:r>
+        <w:rPr>
+          <w:rFonts w:ascii="Times New Roman" w:hAnsi="Times New Roman"/>
+          <w:b w:val="0"/>
+          <w:i/>
+          <w:color w:val="616161"/>
+          <w:sz w:val="18"/>
+        </w:rPr>
+        <w:t>Hình 38.1. Mô hình cấu trúc không gian một đoạn phân tử DNA (SGK KHTN 9)</w:t>
+      </w:r>
+    </w:p>
+    <w:p>
+      <w:pPr>
+        <w:spacing w:before="60" w:after="100"/>
+        <w:ind w:left="283"/>
+        <w:pBdr>
+          <w:top w:val="dashed" w:sz="4" w:space="4" w:color="B0BEC5"/>
+          <w:bottom w:val="dashed" w:sz="4" w:space="4" w:color="B0BEC5"/>
+          <w:left w:val="single" w:sz="12" w:space="6" w:color="7E57C2"/>
+        </w:pBdr>
+      </w:pPr>
+      <w:r>
+        <w:rPr>
+          <w:rFonts w:ascii="Times New Roman" w:hAnsi="Times New Roman"/>
+          <w:b/>
+          <w:i w:val="0"/>
+          <w:color w:val="6A1B9A"/>
+          <w:sz w:val="19"/>
+        </w:rPr>
+        <w:t>✎ Ghi chú &amp; Lời giải trực tiếp trên màn hình:</w:t>
+        <w:br/>
+      </w:r>
+      <w:r>
+        <w:br/>
+      </w:r>
+      <w:r>
+        <w:br/>
+      </w:r>
+      <w:r>
+        <w:br/>
+      </w:r>
+      <w:r>
+        <w:br/>
+      </w:r>
+      <w:r>
+        <w:br/>
+      </w:r>
+    </w:p>
+    <w:p>
+      <w:pPr>
+        <w:keepNext/>
+        <w:spacing w:before="80" w:after="40" w:line="276" w:lineRule="auto"/>
+      </w:pPr>
+      <w:r>
+        <w:rPr>
+          <w:rFonts w:ascii="Times New Roman" w:hAnsi="Times New Roman"/>
+          <w:b/>
+          <w:i w:val="0"/>
+          <w:color w:val="C62828"/>
+          <w:sz w:val="23"/>
+        </w:rPr>
+        <w:t>Câu 4.</w:t>
+      </w:r>
+      <w:r>
+        <w:rPr>
+          <w:rFonts w:ascii="Times New Roman" w:hAnsi="Times New Roman"/>
+          <w:b w:val="0"/>
+          <w:i w:val="0"/>
+          <w:sz w:val="23"/>
+        </w:rPr>
+        <w:t xml:space="preserve"> Trình tự các nucleotide trên một đoạn của DNA như sau:</w:t>
+        <w:br/>
+        <w:t>- A - G - T - T - C - C - A - T - T - G - C - G - A - A - G - T - C -</w:t>
+        <w:br/>
+        <w:t>Hãy xác định trình tự các nucleotide trên mạch bổ sung với mạch đó.</w:t>
+      </w:r>
+    </w:p>
+    <w:p>
+      <w:pPr>
+        <w:spacing w:before="60" w:after="100"/>
+        <w:ind w:left="283"/>
+        <w:pBdr>
+          <w:top w:val="dashed" w:sz="4" w:space="4" w:color="B0BEC5"/>
+          <w:bottom w:val="dashed" w:sz="4" w:space="4" w:color="B0BEC5"/>
+          <w:left w:val="single" w:sz="12" w:space="6" w:color="7E57C2"/>
+        </w:pBdr>
+      </w:pPr>
+      <w:r>
+        <w:rPr>
+          <w:rFonts w:ascii="Times New Roman" w:hAnsi="Times New Roman"/>
+          <w:b/>
+          <w:i w:val="0"/>
+          <w:color w:val="6A1B9A"/>
+          <w:sz w:val="19"/>
+        </w:rPr>
+        <w:t>✎ Ghi chú &amp; Lời giải trực tiếp trên màn hình:</w:t>
+        <w:br/>
+      </w:r>
+      <w:r>
+        <w:br/>
+      </w:r>
+      <w:r>
         <w:br/>
       </w:r>
       <w:r>

</xml_diff>